<commit_message>
Add the leaderboard: read results.txt and show it high to low
Implement show_leaderboard() in storage.c. It reads Name,Score lines,
skips lines in the wrong format, sorts from the highest score to the
lowest (equal scores keep their saved order) and prints a ranked table.
A missing, empty or unreadable results file shows "No results yet".

Update the Test Plan (TC-13 and TC-14 now pass, 20 of 20), SAD open
issues and README status.

Closes #55
Closes #58
Closes #59
</commit_message>
<xml_diff>
--- a/docs/SAD.docx
+++ b/docs/SAD.docx
@@ -5014,7 +5014,7 @@
               <w:rPr>
                 <w:sz w:val="18"/>
               </w:rPr>
-              <w:t>Leaderboard read and sort are not implemented</w:t>
+              <w:t>REQ-12 says "score and percentage" are passed to storage, but the file stores name and score only (BR-4)</w:t>
             </w:r>
           </w:p>
         </w:tc>
@@ -5028,7 +5028,20 @@
               <w:rPr>
                 <w:sz w:val="18"/>
               </w:rPr>
-              <w:t>Sprint-2, Vaishnavi (REQ-14 to REQ-16)</w:t>
+              <w:t xml:space="preserve">The whole </w:t>
+            </w:r>
+            <w:r>
+              <w:rPr>
+                <w:rFonts w:ascii="Consolas" w:hAnsi="Consolas" w:eastAsia="Consolas"/>
+                <w:sz w:val="18"/>
+              </w:rPr>
+              <w:t>Result</w:t>
+            </w:r>
+            <w:r>
+              <w:rPr>
+                <w:sz w:val="18"/>
+              </w:rPr>
+              <w:t xml:space="preserve"> is passed; only name and score are saved</w:t>
             </w:r>
           </w:p>
         </w:tc>
@@ -5058,7 +5071,7 @@
               <w:rPr>
                 <w:sz w:val="18"/>
               </w:rPr>
-              <w:t>REQ-12 says "score and percentage" are passed to storage, but the file stores name and score only (BR-4)</w:t>
+              <w:t>Equal scores have no set order on the leaderboard</w:t>
             </w:r>
           </w:p>
         </w:tc>
@@ -5072,64 +5085,7 @@
               <w:rPr>
                 <w:sz w:val="18"/>
               </w:rPr>
-              <w:t xml:space="preserve">The whole </w:t>
-            </w:r>
-            <w:r>
-              <w:rPr>
-                <w:rFonts w:ascii="Consolas" w:hAnsi="Consolas" w:eastAsia="Consolas"/>
-                <w:sz w:val="18"/>
-              </w:rPr>
-              <w:t>Result</w:t>
-            </w:r>
-            <w:r>
-              <w:rPr>
-                <w:sz w:val="18"/>
-              </w:rPr>
-              <w:t xml:space="preserve"> is passed; only name and score are saved</w:t>
-            </w:r>
-          </w:p>
-        </w:tc>
-      </w:tr>
-      <w:tr>
-        <w:tc>
-          <w:tcPr>
-            <w:tcW w:type="dxa" w:w="3213"/>
-          </w:tcPr>
-          <w:p>
-            <w:r/>
-            <w:r>
-              <w:rPr>
-                <w:sz w:val="18"/>
-              </w:rPr>
-              <w:t>3</w:t>
-            </w:r>
-          </w:p>
-        </w:tc>
-        <w:tc>
-          <w:tcPr>
-            <w:tcW w:type="dxa" w:w="3213"/>
-          </w:tcPr>
-          <w:p>
-            <w:r/>
-            <w:r>
-              <w:rPr>
-                <w:sz w:val="18"/>
-              </w:rPr>
-              <w:t>Equal scores have no set order on the leaderboard</w:t>
-            </w:r>
-          </w:p>
-        </w:tc>
-        <w:tc>
-          <w:tcPr>
-            <w:tcW w:type="dxa" w:w="3213"/>
-          </w:tcPr>
-          <w:p>
-            <w:r/>
-            <w:r>
-              <w:rPr>
-                <w:sz w:val="18"/>
-              </w:rPr>
-              <w:t>Keep the order they appear in the file</w:t>
+              <w:t>They keep the order they were saved in</w:t>
             </w:r>
           </w:p>
         </w:tc>

</xml_diff>